<commit_message>
primer: 5 more expert calls read line by line (18 total); OTA quality gap, Raytheon price claim qualified, learning-over-time datapoint; ledger updated
</commit_message>
<xml_diff>
--- a/themes/ai-native-industrial-production/insights/exports/ANIP-primer-2026-10-25.docx
+++ b/themes/ai-native-industrial-production/insights/exports/ANIP-primer-2026-10-25.docx
@@ -176,7 +176,6 @@
     </w:p>
     <w:p>
       <w:pPr>
-        <w:pStyle w:val="Compact"/>
         <w:numPr>
           <w:ilvl w:val="0"/>
           <w:numId w:val="1002"/>
@@ -193,12 +192,11 @@
         <w:t xml:space="preserve"> </w:t>
       </w:r>
       <w:r>
-        <w:t xml:space="preserve">Only Raytheon reports Hadrian cheaper [src-20250708-2aa3ad]. Three Boeing voices say parity or more: "we have actually paid probably more" (Boeing Defense head of product) [src-20260818-9b2d5c]; Hadrian priced at "PCC or slightly more" (Boeing strategy/M&amp;A lead) [src-20250712-e5e110]. A Northrop GM: "Cost is secondary. Cost is driven usually by schedule" [src-20250707-3b7a46]. The premium buyers pay is for speed.</w:t>
-      </w:r>
-    </w:p>
-    <w:p>
-      <w:pPr>
-        <w:pStyle w:val="Compact"/>
+        <w:t xml:space="preserve">The only "cheaper" report (Raytheon, about 50% lower) came from RFQ quotes before any part was delivered, on a relationship brokered by RTX Ventures, a Hadrian investor [src-20250708-2aa3ad]. A Boeing customer says Xometry is cheapest and a 20-25% price gap means re-sourcing [src-20260802-ef6506]. Three Boeing voices say parity or more: "we have actually paid probably more" (Boeing Defense head of product) [src-20260818-9b2d5c]; Hadrian priced at "PCC or slightly more" (Boeing strategy/M&amp;A lead) [src-20250712-e5e110]. A Northrop GM: "Cost is secondary. Cost is driven usually by schedule" [src-20250707-3b7a46]. The premium buyers pay is for speed.</w:t>
+      </w:r>
+    </w:p>
+    <w:p>
+      <w:pPr>
         <w:numPr>
           <w:ilvl w:val="0"/>
           <w:numId w:val="1002"/>
@@ -220,7 +218,6 @@
     </w:p>
     <w:p>
       <w:pPr>
-        <w:pStyle w:val="Compact"/>
         <w:numPr>
           <w:ilvl w:val="0"/>
           <w:numId w:val="1002"/>
@@ -242,7 +239,6 @@
     </w:p>
     <w:p>
       <w:pPr>
-        <w:pStyle w:val="Compact"/>
         <w:numPr>
           <w:ilvl w:val="0"/>
           <w:numId w:val="1002"/>
@@ -264,7 +260,6 @@
     </w:p>
     <w:p>
       <w:pPr>
-        <w:pStyle w:val="Compact"/>
         <w:numPr>
           <w:ilvl w:val="0"/>
           <w:numId w:val="1002"/>
@@ -282,6 +277,48 @@
       </w:r>
       <w:r>
         <w:t xml:space="preserve">A former Moderna director says buyer budgets have not grown "crazily" in 5-6 years and that the gain is a "step one productivity boost" [src-20260909-af3e60] (low). An Albert Invent director says chemical majors reject royalty models ("The short answer is no") [src-20260913-3ad55e].</w:t>
+      </w:r>
+    </w:p>
+    <w:p>
+      <w:pPr>
+        <w:numPr>
+          <w:ilvl w:val="0"/>
+          <w:numId w:val="1002"/>
+        </w:numPr>
+      </w:pPr>
+      <w:r>
+        <w:rPr>
+          <w:b/>
+          <w:bCs/>
+        </w:rPr>
+        <w:t xml:space="preserve">OTA work hides the quality gap.</w:t>
+      </w:r>
+      <w:r>
+        <w:t xml:space="preserve"> </w:t>
+      </w:r>
+      <w:r>
+        <w:t xml:space="preserve">OTA contracts waive many mil-spec quality requirements; when programs move to standard production contracts, "there's a gap" in statistical lot inspection that Hadrian "is still maturing" on. At thousands of parts its cost curve "asymptotes at a higher level" than traditional shops, and schedule is "near equal" once full inspection is counted (Boeing executive director, customer spending "low single millions" a year, "a fraction of a percent" of outside spend) [src-20260908-ed94f0]. He thinks "low tens of millions" could replicate Hadrian; a Northrop customer engineer thinks it is hard to copy [src-20260802-36d46c].</w:t>
+      </w:r>
+    </w:p>
+    <w:p>
+      <w:pPr>
+        <w:numPr>
+          <w:ilvl w:val="0"/>
+          <w:numId w:val="1002"/>
+        </w:numPr>
+      </w:pPr>
+      <w:r>
+        <w:rPr>
+          <w:b/>
+          <w:bCs/>
+        </w:rPr>
+        <w:t xml:space="preserve">The only learning-over-time number.</w:t>
+      </w:r>
+      <w:r>
+        <w:t xml:space="preserve"> </w:t>
+      </w:r>
+      <w:r>
+        <w:t xml:space="preserve">Hadrian's first programming head: "within a couple of years, we saw a 50% cut" in order-to-first-article time; 70% 24-hour utilization is "very, very realistic"; pricing targets about 30% contribution margin; Opus "is replicable" and the moat is "financial power" plus a five-year head start [src-20261004-9b47f5].</w:t>
       </w:r>
     </w:p>
     <w:p>
@@ -6513,7 +6550,7 @@
               <w:pStyle w:val="Compact"/>
             </w:pPr>
             <w:r>
-              <w:t xml:space="preserve">30-40 day training [src-20260926-70087f]; 25-75% cycle-time cuts per ex-employee [src-20261004-9b47f5]</w:t>
+              <w:t xml:space="preserve">30-40 day training [src-20260926-70087f]; 25-75% cycle-time cuts at a studied shop; 50% cut in order-to-first-article within about two years [src-20261004-9b47f5]</w:t>
             </w:r>
           </w:p>
         </w:tc>
@@ -8795,7 +8832,7 @@
               <w:pStyle w:val="Compact"/>
             </w:pPr>
             <w:r>
-              <w:t xml:space="preserve">Hadrian ~50% lower</w:t>
+              <w:t xml:space="preserve">Hadrian ~50% lower on RFQ quotes; no parts received yet; introduced via RTX Ventures</w:t>
             </w:r>
           </w:p>
         </w:tc>
@@ -8817,7 +8854,7 @@
               <w:pStyle w:val="Compact"/>
             </w:pPr>
             <w:r>
-              <w:t xml:space="preserve">Suppliers at 80-90% utilization</w:t>
+              <w:t xml:space="preserve">Sweet spot $300-700 parts, no castings; suppliers at 80-90% utilization</w:t>
             </w:r>
           </w:p>
         </w:tc>
@@ -15972,18 +16009,18 @@
               <w:pStyle w:val="Compact"/>
             </w:pPr>
             <w:r>
-              <w:t xml:space="preserve">13</w:t>
-            </w:r>
-          </w:p>
-        </w:tc>
-        <w:tc>
-          <w:tcPr/>
-          <w:p>
-            <w:pPr>
-              <w:pStyle w:val="Compact"/>
-            </w:pPr>
-            <w:r>
-              <w:t xml:space="preserve">yes: every line read; notes kept in the ledger</w:t>
+              <w:t xml:space="preserve">18</w:t>
+            </w:r>
+          </w:p>
+        </w:tc>
+        <w:tc>
+          <w:tcPr/>
+          <w:p>
+            <w:pPr>
+              <w:pStyle w:val="Compact"/>
+            </w:pPr>
+            <w:r>
+              <w:t xml:space="preserve">yes: every line read (about 111K words); notes in the ledger</w:t>
             </w:r>
           </w:p>
         </w:tc>
@@ -16042,7 +16079,7 @@
               <w:pStyle w:val="Compact"/>
             </w:pPr>
             <w:r>
-              <w:t xml:space="preserve">207</w:t>
+              <w:t xml:space="preserve">202</w:t>
             </w:r>
           </w:p>
         </w:tc>
@@ -16204,7 +16241,7 @@
         <w:pStyle w:val="BodyText"/>
       </w:pPr>
       <w:r>
-        <w:t xml:space="preserve">Honest limits: about 2.2M on-thesis words exist; only the 13 expert calls (about 83K words) were read line by line. Not read line by line: 15 other on-thesis expert calls (12 cited, 3 uncited; passages and summaries used) and all 99 on-thesis podcasts (27 cited). 20 off-thesis or noise expert calls were checked for category only.</w:t>
+        <w:t xml:space="preserve">Honest limits: about 2.2M on-thesis words exist; about 113K (5%) were read line by line: 18 expert calls plus the 3 promoted items. Not read line by line: 10 other on-thesis expert calls (7 cited, 3 uncited; passages and summaries used) and all 99 on-thesis podcasts (27 cited). 20 off-thesis or noise expert calls were checked for category only.</w:t>
       </w:r>
     </w:p>
     <w:bookmarkEnd w:id="59"/>

</xml_diff>

<commit_message>
primer: 2 more expert calls read line by line (20 total); Isembard urgency premium
</commit_message>
<xml_diff>
--- a/themes/ai-native-industrial-production/insights/exports/ANIP-primer-2026-10-25.docx
+++ b/themes/ai-native-industrial-production/insights/exports/ANIP-primer-2026-10-25.docx
@@ -298,6 +298,27 @@
       </w:r>
       <w:r>
         <w:t xml:space="preserve">OTA contracts waive many mil-spec quality requirements; when programs move to standard production contracts, "there's a gap" in statistical lot inspection that Hadrian "is still maturing" on. At thousands of parts its cost curve "asymptotes at a higher level" than traditional shops, and schedule is "near equal" once full inspection is counted (Boeing executive director, customer spending "low single millions" a year, "a fraction of a percent" of outside spend) [src-20260908-ed94f0]. He thinks "low tens of millions" could replicate Hadrian; a Northrop customer engineer thinks it is hard to copy [src-20260802-36d46c].</w:t>
+      </w:r>
+    </w:p>
+    <w:p>
+      <w:pPr>
+        <w:numPr>
+          <w:ilvl w:val="0"/>
+          <w:numId w:val="1002"/>
+        </w:numPr>
+      </w:pPr>
+      <w:r>
+        <w:rPr>
+          <w:b/>
+          <w:bCs/>
+        </w:rPr>
+        <w:t xml:space="preserve">Distributed networks win on urgency, not cost.</w:t>
+      </w:r>
+      <w:r>
+        <w:t xml:space="preserve"> </w:t>
+      </w:r>
+      <w:r>
+        <w:t xml:space="preserve">An Isembard customer paid $2,300-3,000 for 4-5 simple parts in 2-3 days that would cost about GBP150-200 in China, and sends larger batches to Chinese shops [src-20260621-f96bbd]. An Airbus Defence supply-chain head sees such networks limited to prototypes and non-critical parts while primes consolidate to fewer tier-1s [src-20251106-dfddcb].</w:t>
       </w:r>
     </w:p>
     <w:p>
@@ -16009,18 +16030,18 @@
               <w:pStyle w:val="Compact"/>
             </w:pPr>
             <w:r>
-              <w:t xml:space="preserve">18</w:t>
-            </w:r>
-          </w:p>
-        </w:tc>
-        <w:tc>
-          <w:tcPr/>
-          <w:p>
-            <w:pPr>
-              <w:pStyle w:val="Compact"/>
-            </w:pPr>
-            <w:r>
-              <w:t xml:space="preserve">yes: every line read (about 111K words); notes in the ledger</w:t>
+              <w:t xml:space="preserve">20</w:t>
+            </w:r>
+          </w:p>
+        </w:tc>
+        <w:tc>
+          <w:tcPr/>
+          <w:p>
+            <w:pPr>
+              <w:pStyle w:val="Compact"/>
+            </w:pPr>
+            <w:r>
+              <w:t xml:space="preserve">yes: every line read (about 118K words); notes in the ledger</w:t>
             </w:r>
           </w:p>
         </w:tc>
@@ -16241,7 +16262,7 @@
         <w:pStyle w:val="BodyText"/>
       </w:pPr>
       <w:r>
-        <w:t xml:space="preserve">Honest limits: about 2.2M on-thesis words exist; about 113K (5%) were read line by line: 18 expert calls plus the 3 promoted items. Not read line by line: 10 other on-thesis expert calls (7 cited, 3 uncited; passages and summaries used) and all 99 on-thesis podcasts (27 cited). 20 off-thesis or noise expert calls were checked for category only.</w:t>
+        <w:t xml:space="preserve">Honest limits: about 2.2M on-thesis words exist; about 120K (5%) were read line by line: 20 expert calls plus the 3 promoted items. Not read line by line: 8 other on-thesis expert calls (5 cited, 3 uncited; passages and summaries used) and all 99 on-thesis podcasts (27 cited). 20 off-thesis or noise expert calls were checked for category only.</w:t>
       </w:r>
     </w:p>
     <w:bookmarkEnd w:id="59"/>

</xml_diff>